<commit_message>
Replace CVE lab with Django SQL injection
</commit_message>
<xml_diff>
--- a/report/Work1_Report.docx
+++ b/report/Work1_Report.docx
@@ -58,13 +58,9 @@
       </w:r>
     </w:p>
     <w:p>
-      <w:r>
-        <w:br w:type="page"/>
-      </w:r>
-    </w:p>
-    <w:p>
       <w:pPr>
         <w:pStyle w:val="Heading1"/>
+        <w:pageBreakBefore/>
       </w:pPr>
       <w:r>
         <w:rPr>
@@ -1445,13 +1441,9 @@
       </w:pPr>
     </w:p>
     <w:p>
-      <w:r>
-        <w:br w:type="page"/>
-      </w:r>
-    </w:p>
-    <w:p>
       <w:pPr>
         <w:pStyle w:val="Heading1"/>
+        <w:pageBreakBefore/>
       </w:pPr>
       <w:r>
         <w:rPr>
@@ -2299,7 +2291,7 @@
               <w:rPr>
                 <w:sz w:val="18"/>
               </w:rPr>
-              <w:t>Vulhub screenshots and curl output</w:t>
+              <w:t>Vulhub screenshots and malicious admin lookup</w:t>
             </w:r>
           </w:p>
         </w:tc>
@@ -2388,7 +2380,7 @@
               <w:rPr>
                 <w:sz w:val="18"/>
               </w:rPr>
-              <w:t>Path-normalization explanation</w:t>
+              <w:t>JSONField/HStoreField key handling</w:t>
             </w:r>
           </w:p>
         </w:tc>
@@ -2480,7 +2472,7 @@
               <w:rPr>
                 <w:sz w:val="18"/>
               </w:rPr>
-              <w:t>Version update, blocked exploit, regression test</w:t>
+              <w:t>Django upgrade, blocked SQL error, regression test</w:t>
             </w:r>
           </w:p>
         </w:tc>
@@ -2492,13 +2484,9 @@
       </w:pPr>
     </w:p>
     <w:p>
-      <w:r>
-        <w:br w:type="page"/>
-      </w:r>
-    </w:p>
-    <w:p>
       <w:pPr>
         <w:pStyle w:val="Heading1"/>
+        <w:pageBreakBefore/>
       </w:pPr>
       <w:r>
         <w:rPr>
@@ -2510,18 +2498,15 @@
     </w:p>
     <w:p>
       <w:r>
-        <w:t xml:space="preserve">CVE-2021-41773 is a path traversal vulnerability in Apache HTTP Server 2.4.49. An encoded traversal sequence can escape an aliased directory and expose files outside the intended document root. CGI configurations can also permit command execution. The detailed laboratory procedure is in </w:t>
+        <w:t>CVE-2019-14234 is a SQL injection vulnerability in Django JSONField and HStoreField lookups. It affects Django versions before 2.2.4, 2.1.11, and 1.11.23. The Vulhub demonstration uses Django 2.2.3 and exposes the affected query path through the Collection admin list.</w:t>
       </w:r>
       <w:r>
         <w:rPr>
           <w:rFonts w:ascii="Consolas" w:hAnsi="Consolas"/>
           <w:sz w:val="18"/>
         </w:rPr>
-        <w:t>cve/CVE-2021-41773/README.md</w:t>
       </w:r>
-      <w:r>
-        <w:t>.</w:t>
-      </w:r>
+      <w:r/>
     </w:p>
     <w:p>
       <w:pPr>
@@ -2537,82 +2522,68 @@
     </w:p>
     <w:p>
       <w:r>
-        <w:t xml:space="preserve">Start the official Vulhub </w:t>
+        <w:t>Start the official Vulhub django/CVE-2019-14234 environment with Docker Compose:</w:t>
       </w:r>
       <w:r>
         <w:rPr>
           <w:rFonts w:ascii="Consolas" w:hAnsi="Consolas"/>
           <w:sz w:val="18"/>
         </w:rPr>
-        <w:t>httpd/CVE-2021-41773</w:t>
       </w:r>
-      <w:r>
-        <w:t xml:space="preserve"> environment with Docker Compose:</w:t>
-      </w:r>
+      <w:r/>
     </w:p>
     <w:p>
       <w:pPr>
         <w:pStyle w:val="CodeBlock"/>
       </w:pPr>
       <w:r>
-        <w:t>git clone https://github.com/vulhub/vulhub.git</w:t>
-        <w:br/>
-        <w:t>cd vulhub\httpd\CVE-2021-41773</w:t>
-        <w:br/>
-        <w:t>docker compose build</w:t>
+        <w:t>cd C:\labs\vulhub\django\CVE-2019-14234</w:t>
         <w:br/>
         <w:t>docker compose up -d</w:t>
         <w:br/>
         <w:t>docker compose ps</w:t>
+        <w:br/>
+        <w:t xml:space="preserve">docker compose exec web python -c 'import django; print(django.get_version())' </w:t>
       </w:r>
     </w:p>
     <w:p>
       <w:r>
-        <w:t xml:space="preserve">The </w:t>
+        <w:t>Log in to the Django admin interface at http://127.0.0.1:8000/admin/ using admin / a123123123, then open the malicious JSONField lookup:</w:t>
       </w:r>
       <w:r>
         <w:rPr>
           <w:rFonts w:ascii="Consolas" w:hAnsi="Consolas"/>
           <w:sz w:val="18"/>
         </w:rPr>
-        <w:t>/icons/</w:t>
       </w:r>
+      <w:r/>
       <w:r>
-        <w:t xml:space="preserve"> directory exists in the official image. The following request uses encoded dot segments to move from that alias to </w:t>
+        <w:rPr>
+          <w:rFonts w:ascii="Consolas" w:hAnsi="Consolas"/>
+          <w:sz w:val="18"/>
+        </w:rPr>
+      </w:r>
+      <w:r/>
+    </w:p>
+    <w:p>
+      <w:pPr>
+        <w:pStyle w:val="CodeBlock"/>
+      </w:pPr>
+      <w:r>
+        <w:t>http://127.0.0.1:8000/admin/vuln/collection/?detail__a%27b=123</w:t>
+      </w:r>
+    </w:p>
+    <w:p>
+      <w:r>
+        <w:t>On Django 2.2.3, the crafted detail__a'b lookup reaches the generated SQL identifier context and produces a database error. The vulnerability is improper handling of a user-controlled JSONField key, not a weak admin password.</w:t>
       </w:r>
       <w:r>
         <w:rPr>
           <w:rFonts w:ascii="Consolas" w:hAnsi="Consolas"/>
           <w:sz w:val="18"/>
         </w:rPr>
-        <w:t>/etc/passwd</w:t>
       </w:r>
-      <w:r>
-        <w:t>:</w:t>
-      </w:r>
-    </w:p>
-    <w:p>
-      <w:pPr>
-        <w:pStyle w:val="CodeBlock"/>
-      </w:pPr>
-      <w:r>
-        <w:t>curl.exe -v --path-as-is "http://127.0.0.1:8080/icons/.%2e/%2e%2e/%2e%2e/%2e%2e/etc/passwd"</w:t>
-      </w:r>
-    </w:p>
-    <w:p>
-      <w:r>
-        <w:t xml:space="preserve">When the vulnerable server returns the host file, the path traversal is reproduced. The cause is incorrect normalization and authorization of encoded path segments after the alias resolution step. The request crosses the intended filesystem boundary even though it appears to address a path under </w:t>
-      </w:r>
-      <w:r>
-        <w:rPr>
-          <w:rFonts w:ascii="Consolas" w:hAnsi="Consolas"/>
-          <w:sz w:val="18"/>
-        </w:rPr>
-        <w:t>/icons/</w:t>
-      </w:r>
-      <w:r>
-        <w:t>.</w:t>
-      </w:r>
+      <w:r/>
     </w:p>
     <w:p>
       <w:pPr>
@@ -2628,7 +2599,7 @@
     </w:p>
     <w:p>
       <w:r>
-        <w:t>The fix upgrades the Apache image from 2.4.49 to 2.4.51, the first release with the complete correction. After rebuilding the container, the same request must fail and a normal request to the web root must still succeed. The attached patch and rebuilt configuration provide the required source of the change.</w:t>
+        <w:t>Django corrected the issue in 2.2.4, 2.1.11, and 1.11.23. The supplied fix builds Django 2.2.4 from the working Vulhub 2.2.3 image. After recreating the laboratory database, the same lookup must no longer produce an SQL error, while the normal Collection admin page must still load.</w:t>
       </w:r>
     </w:p>
     <w:p>
@@ -2636,18 +2607,22 @@
         <w:pStyle w:val="CodeBlock"/>
       </w:pPr>
       <w:r>
-        <w:t>docker compose down</w:t>
+        <w:t>docker compose down -v</w:t>
         <w:br/>
-        <w:t>docker compose build</w:t>
+        <w:t>Copy-Item 'D:\学校\课程文件\Information Security\work1\cve\CVE-2019-14234\fix\patched\docker-compose.yml' -Destination '.\docker-compose.yml' -Force</w:t>
+        <w:br/>
+        <w:t>Copy-Item 'D:\学校\课程文件\Information Security\work1\cve\CVE-2019-14234\fix\patched\Dockerfile' -Destination '.\Dockerfile' -Force</w:t>
+        <w:br/>
+        <w:t>docker compose build --no-cache</w:t>
         <w:br/>
         <w:t>docker compose up -d</w:t>
         <w:br/>
-        <w:t>curl.exe -i "http://127.0.0.1:8080/"</w:t>
+        <w:t xml:space="preserve">docker compose exec web python -c 'import django; print(django.get_version())' </w:t>
       </w:r>
     </w:p>
     <w:p>
       <w:r>
-        <w:t>The report must include actual screenshots showing the vulnerable response, the blocked response after the fix, and the passing regression request.</w:t>
+        <w:t>The Evidence section records the vulnerable Django version, the SQL error caused by the crafted lookup, the corrected result, and the normal admin page after the upgrade.</w:t>
       </w:r>
     </w:p>
     <w:p>
@@ -2788,7 +2763,7 @@
               <w:rPr>
                 <w:sz w:val="18"/>
               </w:rPr>
-              <w:t>Apache version and running Vulhub container</w:t>
+              <w:t>Django 2.2.3 and running Vulhub containers</w:t>
             </w:r>
           </w:p>
         </w:tc>
@@ -2850,7 +2825,7 @@
               <w:rPr>
                 <w:sz w:val="18"/>
               </w:rPr>
-              <w:t>Full traversal request and disclosed file</w:t>
+              <w:t>Malicious detail__a'b lookup and database error</w:t>
             </w:r>
           </w:p>
         </w:tc>
@@ -2910,7 +2885,7 @@
               <w:rPr>
                 <w:sz w:val="18"/>
               </w:rPr>
-              <w:t>Same request blocked after rebuilding</w:t>
+              <w:t>Same lookup without SQL error on Django 2.2.4</w:t>
             </w:r>
           </w:p>
         </w:tc>
@@ -2972,7 +2947,7 @@
               <w:rPr>
                 <w:sz w:val="18"/>
               </w:rPr>
-              <w:t>Normal service request still successful</w:t>
+              <w:t>Normal Collection admin list still loads</w:t>
             </w:r>
           </w:p>
         </w:tc>
@@ -2984,13 +2959,680 @@
       </w:pPr>
     </w:p>
     <w:p>
+      <w:pPr>
+        <w:pStyle w:val="Heading1"/>
+        <w:pageBreakBefore/>
+      </w:pPr>
       <w:r>
-        <w:br w:type="page"/>
+        <w:rPr>
+          <w:color w:val="000000"/>
+        </w:rPr>
+        <w:t>Evidence</w:t>
+      </w:r>
+    </w:p>
+    <w:p>
+      <w:r>
+        <w:t>The following screenshots are the actual local and CI results used for this submission. They cover the automated checks, API behavior, vulnerable environment, successful exploit, fixed version, and regression test.</w:t>
+      </w:r>
+    </w:p>
+    <w:p>
+      <w:pPr>
+        <w:spacing w:before="80" w:after="60"/>
+        <w:jc w:val="center"/>
+      </w:pPr>
+      <w:r>
+        <w:drawing>
+          <wp:inline xmlns:a="http://schemas.openxmlformats.org/drawingml/2006/main" xmlns:pic="http://schemas.openxmlformats.org/drawingml/2006/picture">
+            <wp:extent cx="5166360" cy="3294890"/>
+            <wp:docPr id="1" name="Picture 1"/>
+            <wp:cNvGraphicFramePr>
+              <a:graphicFrameLocks noChangeAspect="1"/>
+            </wp:cNvGraphicFramePr>
+            <a:graphic>
+              <a:graphicData uri="http://schemas.openxmlformats.org/drawingml/2006/picture">
+                <pic:pic>
+                  <pic:nvPicPr>
+                    <pic:cNvPr id="0" name="01-bandit-sast.png"/>
+                    <pic:cNvPicPr/>
+                  </pic:nvPicPr>
+                  <pic:blipFill>
+                    <a:blip r:embed="rId10"/>
+                    <a:stretch>
+                      <a:fillRect/>
+                    </a:stretch>
+                  </pic:blipFill>
+                  <pic:spPr>
+                    <a:xfrm>
+                      <a:off x="0" y="0"/>
+                      <a:ext cx="5166360" cy="3294890"/>
+                    </a:xfrm>
+                    <a:prstGeom prst="rect"/>
+                  </pic:spPr>
+                </pic:pic>
+              </a:graphicData>
+            </a:graphic>
+          </wp:inline>
+        </w:drawing>
+      </w:r>
+    </w:p>
+    <w:p>
+      <w:pPr>
+        <w:spacing w:after="160"/>
+        <w:jc w:val="center"/>
+      </w:pPr>
+      <w:r>
+        <w:rPr>
+          <w:i/>
+          <w:color w:val="464646"/>
+          <w:sz w:val="18"/>
+        </w:rPr>
+        <w:t>Figure 1. pytest and Bandit SAST results.</w:t>
+      </w:r>
+    </w:p>
+    <w:p>
+      <w:pPr>
+        <w:spacing w:before="80" w:after="60"/>
+        <w:jc w:val="center"/>
+      </w:pPr>
+      <w:r>
+        <w:drawing>
+          <wp:inline xmlns:a="http://schemas.openxmlformats.org/drawingml/2006/main" xmlns:pic="http://schemas.openxmlformats.org/drawingml/2006/picture">
+            <wp:extent cx="5166360" cy="3704841"/>
+            <wp:docPr id="2" name="Picture 2"/>
+            <wp:cNvGraphicFramePr>
+              <a:graphicFrameLocks noChangeAspect="1"/>
+            </wp:cNvGraphicFramePr>
+            <a:graphic>
+              <a:graphicData uri="http://schemas.openxmlformats.org/drawingml/2006/picture">
+                <pic:pic>
+                  <pic:nvPicPr>
+                    <pic:cNvPr id="0" name="02-snyk-sca.png"/>
+                    <pic:cNvPicPr/>
+                  </pic:nvPicPr>
+                  <pic:blipFill>
+                    <a:blip r:embed="rId11"/>
+                    <a:stretch>
+                      <a:fillRect/>
+                    </a:stretch>
+                  </pic:blipFill>
+                  <pic:spPr>
+                    <a:xfrm>
+                      <a:off x="0" y="0"/>
+                      <a:ext cx="5166360" cy="3704841"/>
+                    </a:xfrm>
+                    <a:prstGeom prst="rect"/>
+                  </pic:spPr>
+                </pic:pic>
+              </a:graphicData>
+            </a:graphic>
+          </wp:inline>
+        </w:drawing>
+      </w:r>
+    </w:p>
+    <w:p>
+      <w:pPr>
+        <w:spacing w:after="160"/>
+        <w:jc w:val="center"/>
+      </w:pPr>
+      <w:r>
+        <w:rPr>
+          <w:i/>
+          <w:color w:val="464646"/>
+          <w:sz w:val="18"/>
+        </w:rPr>
+        <w:t>Figure 2. Snyk software composition analysis.</w:t>
+      </w:r>
+    </w:p>
+    <w:p>
+      <w:pPr>
+        <w:pageBreakBefore/>
+        <w:spacing w:before="80" w:after="60"/>
+        <w:jc w:val="center"/>
+      </w:pPr>
+      <w:r>
+        <w:drawing>
+          <wp:inline xmlns:a="http://schemas.openxmlformats.org/drawingml/2006/main" xmlns:pic="http://schemas.openxmlformats.org/drawingml/2006/picture">
+            <wp:extent cx="5669280" cy="3394751"/>
+            <wp:docPr id="3" name="Picture 3"/>
+            <wp:cNvGraphicFramePr>
+              <a:graphicFrameLocks noChangeAspect="1"/>
+            </wp:cNvGraphicFramePr>
+            <a:graphic>
+              <a:graphicData uri="http://schemas.openxmlformats.org/drawingml/2006/picture">
+                <pic:pic>
+                  <pic:nvPicPr>
+                    <pic:cNvPr id="0" name="11-ci-success.png"/>
+                    <pic:cNvPicPr/>
+                  </pic:nvPicPr>
+                  <pic:blipFill>
+                    <a:blip r:embed="rId12"/>
+                    <a:stretch>
+                      <a:fillRect/>
+                    </a:stretch>
+                  </pic:blipFill>
+                  <pic:spPr>
+                    <a:xfrm>
+                      <a:off x="0" y="0"/>
+                      <a:ext cx="5669280" cy="3394751"/>
+                    </a:xfrm>
+                    <a:prstGeom prst="rect"/>
+                  </pic:spPr>
+                </pic:pic>
+              </a:graphicData>
+            </a:graphic>
+          </wp:inline>
+        </w:drawing>
+      </w:r>
+    </w:p>
+    <w:p>
+      <w:pPr>
+        <w:spacing w:after="160"/>
+        <w:jc w:val="center"/>
+      </w:pPr>
+      <w:r>
+        <w:rPr>
+          <w:i/>
+          <w:color w:val="464646"/>
+          <w:sz w:val="18"/>
+        </w:rPr>
+        <w:t>Figure 3. Successful GitHub Actions pipeline.</w:t>
+      </w:r>
+    </w:p>
+    <w:p>
+      <w:pPr>
+        <w:spacing w:before="80" w:after="60"/>
+        <w:jc w:val="center"/>
+      </w:pPr>
+      <w:r>
+        <w:drawing>
+          <wp:inline xmlns:a="http://schemas.openxmlformats.org/drawingml/2006/main" xmlns:pic="http://schemas.openxmlformats.org/drawingml/2006/picture">
+            <wp:extent cx="5669280" cy="1144503"/>
+            <wp:docPr id="4" name="Picture 4"/>
+            <wp:cNvGraphicFramePr>
+              <a:graphicFrameLocks noChangeAspect="1"/>
+            </wp:cNvGraphicFramePr>
+            <a:graphic>
+              <a:graphicData uri="http://schemas.openxmlformats.org/drawingml/2006/picture">
+                <pic:pic>
+                  <pic:nvPicPr>
+                    <pic:cNvPr id="0" name="03-api-login.png"/>
+                    <pic:cNvPicPr/>
+                  </pic:nvPicPr>
+                  <pic:blipFill>
+                    <a:blip r:embed="rId13"/>
+                    <a:stretch>
+                      <a:fillRect/>
+                    </a:stretch>
+                  </pic:blipFill>
+                  <pic:spPr>
+                    <a:xfrm>
+                      <a:off x="0" y="0"/>
+                      <a:ext cx="5669280" cy="1144503"/>
+                    </a:xfrm>
+                    <a:prstGeom prst="rect"/>
+                  </pic:spPr>
+                </pic:pic>
+              </a:graphicData>
+            </a:graphic>
+          </wp:inline>
+        </w:drawing>
+      </w:r>
+    </w:p>
+    <w:p>
+      <w:pPr>
+        <w:spacing w:after="160"/>
+        <w:jc w:val="center"/>
+      </w:pPr>
+      <w:r>
+        <w:rPr>
+          <w:i/>
+          <w:color w:val="464646"/>
+          <w:sz w:val="18"/>
+        </w:rPr>
+        <w:t>Figure 4. Successful login and JWT response.</w:t>
+      </w:r>
+    </w:p>
+    <w:p>
+      <w:pPr>
+        <w:spacing w:before="80" w:after="60"/>
+        <w:jc w:val="center"/>
+      </w:pPr>
+      <w:r>
+        <w:drawing>
+          <wp:inline xmlns:a="http://schemas.openxmlformats.org/drawingml/2006/main" xmlns:pic="http://schemas.openxmlformats.org/drawingml/2006/picture">
+            <wp:extent cx="5669280" cy="1794374"/>
+            <wp:docPr id="5" name="Picture 5"/>
+            <wp:cNvGraphicFramePr>
+              <a:graphicFrameLocks noChangeAspect="1"/>
+            </wp:cNvGraphicFramePr>
+            <a:graphic>
+              <a:graphicData uri="http://schemas.openxmlformats.org/drawingml/2006/picture">
+                <pic:pic>
+                  <pic:nvPicPr>
+                    <pic:cNvPr id="0" name="03b-api-authenticated-data.png"/>
+                    <pic:cNvPicPr/>
+                  </pic:nvPicPr>
+                  <pic:blipFill>
+                    <a:blip r:embed="rId14"/>
+                    <a:stretch>
+                      <a:fillRect/>
+                    </a:stretch>
+                  </pic:blipFill>
+                  <pic:spPr>
+                    <a:xfrm>
+                      <a:off x="0" y="0"/>
+                      <a:ext cx="5669280" cy="1794374"/>
+                    </a:xfrm>
+                    <a:prstGeom prst="rect"/>
+                  </pic:spPr>
+                </pic:pic>
+              </a:graphicData>
+            </a:graphic>
+          </wp:inline>
+        </w:drawing>
+      </w:r>
+    </w:p>
+    <w:p>
+      <w:pPr>
+        <w:spacing w:after="160"/>
+        <w:jc w:val="center"/>
+      </w:pPr>
+      <w:r>
+        <w:rPr>
+          <w:i/>
+          <w:color w:val="464646"/>
+          <w:sz w:val="18"/>
+        </w:rPr>
+        <w:t>Figure 5. Authenticated user data retrieval.</w:t>
+      </w:r>
+    </w:p>
+    <w:p>
+      <w:pPr>
+        <w:pageBreakBefore/>
+        <w:spacing w:before="80" w:after="60"/>
+        <w:jc w:val="center"/>
+      </w:pPr>
+      <w:r>
+        <w:drawing>
+          <wp:inline xmlns:a="http://schemas.openxmlformats.org/drawingml/2006/main" xmlns:pic="http://schemas.openxmlformats.org/drawingml/2006/picture">
+            <wp:extent cx="5669280" cy="869807"/>
+            <wp:docPr id="6" name="Picture 6"/>
+            <wp:cNvGraphicFramePr>
+              <a:graphicFrameLocks noChangeAspect="1"/>
+            </wp:cNvGraphicFramePr>
+            <a:graphic>
+              <a:graphicData uri="http://schemas.openxmlformats.org/drawingml/2006/picture">
+                <pic:pic>
+                  <pic:nvPicPr>
+                    <pic:cNvPr id="0" name="04-api-unauthorized.png"/>
+                    <pic:cNvPicPr/>
+                  </pic:nvPicPr>
+                  <pic:blipFill>
+                    <a:blip r:embed="rId15"/>
+                    <a:stretch>
+                      <a:fillRect/>
+                    </a:stretch>
+                  </pic:blipFill>
+                  <pic:spPr>
+                    <a:xfrm>
+                      <a:off x="0" y="0"/>
+                      <a:ext cx="5669280" cy="869807"/>
+                    </a:xfrm>
+                    <a:prstGeom prst="rect"/>
+                  </pic:spPr>
+                </pic:pic>
+              </a:graphicData>
+            </a:graphic>
+          </wp:inline>
+        </w:drawing>
+      </w:r>
+    </w:p>
+    <w:p>
+      <w:pPr>
+        <w:spacing w:after="160"/>
+        <w:jc w:val="center"/>
+      </w:pPr>
+      <w:r>
+        <w:rPr>
+          <w:i/>
+          <w:color w:val="464646"/>
+          <w:sz w:val="18"/>
+        </w:rPr>
+        <w:t>Figure 6. Protected endpoint rejects a request without a token.</w:t>
+      </w:r>
+    </w:p>
+    <w:p>
+      <w:pPr>
+        <w:spacing w:before="80" w:after="60"/>
+        <w:jc w:val="center"/>
+      </w:pPr>
+      <w:r>
+        <w:drawing>
+          <wp:inline xmlns:a="http://schemas.openxmlformats.org/drawingml/2006/main" xmlns:pic="http://schemas.openxmlformats.org/drawingml/2006/picture">
+            <wp:extent cx="5669280" cy="1474012"/>
+            <wp:docPr id="7" name="Picture 7"/>
+            <wp:cNvGraphicFramePr>
+              <a:graphicFrameLocks noChangeAspect="1"/>
+            </wp:cNvGraphicFramePr>
+            <a:graphic>
+              <a:graphicData uri="http://schemas.openxmlformats.org/drawingml/2006/picture">
+                <pic:pic>
+                  <pic:nvPicPr>
+                    <pic:cNvPr id="0" name="05-api-sqli-rejected.png"/>
+                    <pic:cNvPicPr/>
+                  </pic:nvPicPr>
+                  <pic:blipFill>
+                    <a:blip r:embed="rId16"/>
+                    <a:stretch>
+                      <a:fillRect/>
+                    </a:stretch>
+                  </pic:blipFill>
+                  <pic:spPr>
+                    <a:xfrm>
+                      <a:off x="0" y="0"/>
+                      <a:ext cx="5669280" cy="1474012"/>
+                    </a:xfrm>
+                    <a:prstGeom prst="rect"/>
+                  </pic:spPr>
+                </pic:pic>
+              </a:graphicData>
+            </a:graphic>
+          </wp:inline>
+        </w:drawing>
+      </w:r>
+    </w:p>
+    <w:p>
+      <w:pPr>
+        <w:spacing w:after="160"/>
+        <w:jc w:val="center"/>
+      </w:pPr>
+      <w:r>
+        <w:rPr>
+          <w:i/>
+          <w:color w:val="464646"/>
+          <w:sz w:val="18"/>
+        </w:rPr>
+        <w:t>Figure 7. SQL injection login attempt is rejected.</w:t>
+      </w:r>
+    </w:p>
+    <w:p>
+      <w:pPr>
+        <w:spacing w:before="80" w:after="60"/>
+        <w:jc w:val="center"/>
+      </w:pPr>
+      <w:r>
+        <w:drawing>
+          <wp:inline xmlns:a="http://schemas.openxmlformats.org/drawingml/2006/main" xmlns:pic="http://schemas.openxmlformats.org/drawingml/2006/picture">
+            <wp:extent cx="5669280" cy="1924402"/>
+            <wp:docPr id="8" name="Picture 8"/>
+            <wp:cNvGraphicFramePr>
+              <a:graphicFrameLocks noChangeAspect="1"/>
+            </wp:cNvGraphicFramePr>
+            <a:graphic>
+              <a:graphicData uri="http://schemas.openxmlformats.org/drawingml/2006/picture">
+                <pic:pic>
+                  <pic:nvPicPr>
+                    <pic:cNvPr id="0" name="06-api-xss-escaped.png"/>
+                    <pic:cNvPicPr/>
+                  </pic:nvPicPr>
+                  <pic:blipFill>
+                    <a:blip r:embed="rId17"/>
+                    <a:stretch>
+                      <a:fillRect/>
+                    </a:stretch>
+                  </pic:blipFill>
+                  <pic:spPr>
+                    <a:xfrm>
+                      <a:off x="0" y="0"/>
+                      <a:ext cx="5669280" cy="1924402"/>
+                    </a:xfrm>
+                    <a:prstGeom prst="rect"/>
+                  </pic:spPr>
+                </pic:pic>
+              </a:graphicData>
+            </a:graphic>
+          </wp:inline>
+        </w:drawing>
+      </w:r>
+    </w:p>
+    <w:p>
+      <w:pPr>
+        <w:spacing w:after="160"/>
+        <w:jc w:val="center"/>
+      </w:pPr>
+      <w:r>
+        <w:rPr>
+          <w:i/>
+          <w:color w:val="464646"/>
+          <w:sz w:val="18"/>
+        </w:rPr>
+        <w:t>Figure 8. XSS-bearing input is returned as escaped HTML entities.</w:t>
+      </w:r>
+    </w:p>
+    <w:p>
+      <w:pPr>
+        <w:pageBreakBefore/>
+        <w:spacing w:before="80" w:after="60"/>
+        <w:jc w:val="center"/>
+      </w:pPr>
+      <w:r>
+        <w:drawing>
+          <wp:inline xmlns:a="http://schemas.openxmlformats.org/drawingml/2006/main" xmlns:pic="http://schemas.openxmlformats.org/drawingml/2006/picture">
+            <wp:extent cx="5669280" cy="953773"/>
+            <wp:docPr id="9" name="Picture 9"/>
+            <wp:cNvGraphicFramePr>
+              <a:graphicFrameLocks noChangeAspect="1"/>
+            </wp:cNvGraphicFramePr>
+            <a:graphic>
+              <a:graphicData uri="http://schemas.openxmlformats.org/drawingml/2006/picture">
+                <pic:pic>
+                  <pic:nvPicPr>
+                    <pic:cNvPr id="0" name="07-cve-version.png"/>
+                    <pic:cNvPicPr/>
+                  </pic:nvPicPr>
+                  <pic:blipFill>
+                    <a:blip r:embed="rId22"/>
+                    <a:stretch>
+                      <a:fillRect/>
+                    </a:stretch>
+                  </pic:blipFill>
+                  <pic:spPr>
+                    <a:xfrm>
+                      <a:off x="0" y="0"/>
+                      <a:ext cx="5669280" cy="953773"/>
+                    </a:xfrm>
+                    <a:prstGeom prst="rect"/>
+                  </pic:spPr>
+                </pic:pic>
+              </a:graphicData>
+            </a:graphic>
+          </wp:inline>
+        </w:drawing>
+      </w:r>
+    </w:p>
+    <w:p>
+      <w:pPr>
+        <w:spacing w:after="160"/>
+        <w:jc w:val="center"/>
+      </w:pPr>
+      <w:r>
+        <w:rPr>
+          <w:i/>
+          <w:color w:val="464646"/>
+          <w:sz w:val="18"/>
+        </w:rPr>
+        <w:t>Figure 9. Django 2.2.3 vulnerable environment.</w:t>
+      </w:r>
+    </w:p>
+    <w:p>
+      <w:pPr>
+        <w:pageBreakBefore/>
+        <w:spacing w:before="80" w:after="60"/>
+        <w:jc w:val="center"/>
+      </w:pPr>
+      <w:r>
+        <w:drawing>
+          <wp:inline xmlns:a="http://schemas.openxmlformats.org/drawingml/2006/main" xmlns:pic="http://schemas.openxmlformats.org/drawingml/2006/picture">
+            <wp:extent cx="5669280" cy="3150101"/>
+            <wp:docPr id="10" name="Picture 10"/>
+            <wp:cNvGraphicFramePr>
+              <a:graphicFrameLocks noChangeAspect="1"/>
+            </wp:cNvGraphicFramePr>
+            <a:graphic>
+              <a:graphicData uri="http://schemas.openxmlformats.org/drawingml/2006/picture">
+                <pic:pic>
+                  <pic:nvPicPr>
+                    <pic:cNvPr id="0" name="08-cve-exploit.png"/>
+                    <pic:cNvPicPr/>
+                  </pic:nvPicPr>
+                  <pic:blipFill>
+                    <a:blip r:embed="rId23"/>
+                    <a:stretch>
+                      <a:fillRect/>
+                    </a:stretch>
+                  </pic:blipFill>
+                  <pic:spPr>
+                    <a:xfrm>
+                      <a:off x="0" y="0"/>
+                      <a:ext cx="5669280" cy="3150101"/>
+                    </a:xfrm>
+                    <a:prstGeom prst="rect"/>
+                  </pic:spPr>
+                </pic:pic>
+              </a:graphicData>
+            </a:graphic>
+          </wp:inline>
+        </w:drawing>
+      </w:r>
+    </w:p>
+    <w:p>
+      <w:pPr>
+        <w:spacing w:after="160"/>
+        <w:jc w:val="center"/>
+      </w:pPr>
+      <w:r>
+        <w:rPr>
+          <w:i/>
+          <w:color w:val="464646"/>
+          <w:sz w:val="18"/>
+        </w:rPr>
+        <w:t>Figure 10. Malicious JSONField lookup produces a database error.</w:t>
+      </w:r>
+    </w:p>
+    <w:p>
+      <w:pPr>
+        <w:pageBreakBefore/>
+        <w:spacing w:before="80" w:after="60"/>
+        <w:jc w:val="center"/>
+      </w:pPr>
+      <w:r>
+        <w:drawing>
+          <wp:inline xmlns:a="http://schemas.openxmlformats.org/drawingml/2006/main" xmlns:pic="http://schemas.openxmlformats.org/drawingml/2006/picture">
+            <wp:extent cx="5669280" cy="3753873"/>
+            <wp:docPr id="11" name="Picture 11"/>
+            <wp:cNvGraphicFramePr>
+              <a:graphicFrameLocks noChangeAspect="1"/>
+            </wp:cNvGraphicFramePr>
+            <a:graphic>
+              <a:graphicData uri="http://schemas.openxmlformats.org/drawingml/2006/picture">
+                <pic:pic>
+                  <pic:nvPicPr>
+                    <pic:cNvPr id="0" name="09-cve-fixed.png"/>
+                    <pic:cNvPicPr/>
+                  </pic:nvPicPr>
+                  <pic:blipFill>
+                    <a:blip r:embed="rId24"/>
+                    <a:stretch>
+                      <a:fillRect/>
+                    </a:stretch>
+                  </pic:blipFill>
+                  <pic:spPr>
+                    <a:xfrm>
+                      <a:off x="0" y="0"/>
+                      <a:ext cx="5669280" cy="3753873"/>
+                    </a:xfrm>
+                    <a:prstGeom prst="rect"/>
+                  </pic:spPr>
+                </pic:pic>
+              </a:graphicData>
+            </a:graphic>
+          </wp:inline>
+        </w:drawing>
+      </w:r>
+    </w:p>
+    <w:p>
+      <w:pPr>
+        <w:spacing w:after="160"/>
+        <w:jc w:val="center"/>
+      </w:pPr>
+      <w:r>
+        <w:rPr>
+          <w:i/>
+          <w:color w:val="464646"/>
+          <w:sz w:val="18"/>
+        </w:rPr>
+        <w:t>Figure 11. The same lookup no longer produces an SQL error after upgrade.</w:t>
+      </w:r>
+    </w:p>
+    <w:p>
+      <w:pPr>
+        <w:pageBreakBefore/>
+        <w:spacing w:before="80" w:after="60"/>
+        <w:jc w:val="center"/>
+      </w:pPr>
+      <w:r>
+        <w:drawing>
+          <wp:inline xmlns:a="http://schemas.openxmlformats.org/drawingml/2006/main" xmlns:pic="http://schemas.openxmlformats.org/drawingml/2006/picture">
+            <wp:extent cx="5669280" cy="3717200"/>
+            <wp:docPr id="12" name="Picture 12"/>
+            <wp:cNvGraphicFramePr>
+              <a:graphicFrameLocks noChangeAspect="1"/>
+            </wp:cNvGraphicFramePr>
+            <a:graphic>
+              <a:graphicData uri="http://schemas.openxmlformats.org/drawingml/2006/picture">
+                <pic:pic>
+                  <pic:nvPicPr>
+                    <pic:cNvPr id="0" name="10-regression.png"/>
+                    <pic:cNvPicPr/>
+                  </pic:nvPicPr>
+                  <pic:blipFill>
+                    <a:blip r:embed="rId25"/>
+                    <a:stretch>
+                      <a:fillRect/>
+                    </a:stretch>
+                  </pic:blipFill>
+                  <pic:spPr>
+                    <a:xfrm>
+                      <a:off x="0" y="0"/>
+                      <a:ext cx="5669280" cy="3717200"/>
+                    </a:xfrm>
+                    <a:prstGeom prst="rect"/>
+                  </pic:spPr>
+                </pic:pic>
+              </a:graphicData>
+            </a:graphic>
+          </wp:inline>
+        </w:drawing>
+      </w:r>
+    </w:p>
+    <w:p>
+      <w:pPr>
+        <w:spacing w:after="160"/>
+        <w:jc w:val="center"/>
+      </w:pPr>
+      <w:r>
+        <w:rPr>
+          <w:i/>
+          <w:color w:val="464646"/>
+          <w:sz w:val="18"/>
+        </w:rPr>
+        <w:t>Figure 12. Normal Collection admin page remains functional after the fix.</w:t>
       </w:r>
     </w:p>
     <w:p>
       <w:pPr>
         <w:pStyle w:val="Heading1"/>
+        <w:pageBreakBefore/>
       </w:pPr>
       <w:r>
         <w:rPr>
@@ -3137,13 +3779,9 @@
       </w:r>
     </w:p>
     <w:p>
-      <w:r>
-        <w:br w:type="page"/>
-      </w:r>
-    </w:p>
-    <w:p>
       <w:pPr>
         <w:pStyle w:val="Heading1"/>
+        <w:pageBreakBefore/>
       </w:pPr>
       <w:r>
         <w:rPr>
@@ -3222,7 +3860,7 @@
         <w:pStyle w:val="ListNumber"/>
       </w:pPr>
       <w:r>
-        <w:t>Apache HTTP Server security: https://httpd.apache.org/security/vulnerabilities_24.html</w:t>
+        <w:t>CVE-2019-14234: https://nvd.nist.gov/vuln/detail/CVE-2019-14234</w:t>
       </w:r>
     </w:p>
     <w:p>
@@ -3242,7 +3880,7 @@
         <w:pStyle w:val="ListBullet"/>
       </w:pPr>
       <w:r>
-        <w:t>Public repository: [insert URL]</w:t>
+        <w:t>Public repository: https://github.com/twq0316/work1-secure-rest-api</w:t>
       </w:r>
     </w:p>
     <w:p>
@@ -3250,7 +3888,7 @@
         <w:pStyle w:val="ListBullet"/>
       </w:pPr>
       <w:r>
-        <w:t>Successful CI run: [insert URL]</w:t>
+        <w:t>Successful CI run: https://github.com/twq0316/work1-secure-rest-api/actions/runs/39366903218</w:t>
       </w:r>
     </w:p>
     <w:p>
@@ -3258,7 +3896,7 @@
         <w:pStyle w:val="ListBullet"/>
       </w:pPr>
       <w:r>
-        <w:t>SAST report: [insert screenshot or report link]</w:t>
+        <w:t>SAST report: evidence/screenshots/01-bandit-sast.png</w:t>
       </w:r>
     </w:p>
     <w:p>
@@ -3266,7 +3904,7 @@
         <w:pStyle w:val="ListBullet"/>
       </w:pPr>
       <w:r>
-        <w:t>SCA report: [insert screenshot or report link]</w:t>
+        <w:t>SCA report: evidence/screenshots/02-snyk-sca.png</w:t>
       </w:r>
     </w:p>
     <w:p>
@@ -3274,7 +3912,7 @@
         <w:pStyle w:val="ListBullet"/>
       </w:pPr>
       <w:r>
-        <w:t>Reproduction evidence: [insert screenshot names]</w:t>
+        <w:t>Reproduction evidence: 07-cve-version.png, 08-cve-exploit.png, 10-regression.png</w:t>
       </w:r>
     </w:p>
     <w:p>
@@ -3282,7 +3920,7 @@
         <w:pStyle w:val="ListBullet"/>
       </w:pPr>
       <w:r>
-        <w:t>Fixed-version evidence: [insert screenshot names]</w:t>
+        <w:t>Fixed-version evidence: 09-cve-fixed.png</w:t>
       </w:r>
     </w:p>
     <w:tbl>
@@ -3411,7 +4049,7 @@
               <w:rPr>
                 <w:sz w:val="18"/>
               </w:rPr>
-              <w:t>[insert URL]</w:t>
+              <w:t>https://github.com/twq0316/work1-secure-rest-api</w:t>
             </w:r>
           </w:p>
         </w:tc>
@@ -3899,7 +4537,7 @@
               <w:rPr>
                 <w:sz w:val="18"/>
               </w:rPr>
-              <w:t>[insert workflow URL]</w:t>
+              <w:t>https://github.com/twq0316/work1-secure-rest-api/actions/runs/39366903218</w:t>
             </w:r>
           </w:p>
         </w:tc>
@@ -3961,7 +4599,7 @@
               <w:rPr>
                 <w:sz w:val="18"/>
               </w:rPr>
-              <w:t>`cve/CVE-2021-41773/fix`</w:t>
+              <w:t>`cve/CVE-2019-14234/fix`</w:t>
             </w:r>
           </w:p>
         </w:tc>

</xml_diff>